<commit_message>
Add reference links to Melia report
Co-Authored-By: Claude Sonnet 5.5 <noreply@anthropic.com>
Claude-Session: https://claude.ai/code/session_014v2hzvZxBvzsJSoqcehBzV
</commit_message>
<xml_diff>
--- a/Melia-Promise-and-Proof-professional.docx
+++ b/Melia-Promise-and-Proof-professional.docx
@@ -1451,7 +1451,7 @@
         <w:t>Harvard Business Review</w:t>
       </w:r>
       <w:r>
-        <w:t>, 35(5), pp. 113-124.</w:t>
+        <w:t>, 35(5), pp. 113-124. Available at: https://hbr.org/1957/09/strategies-for-diversification (Accessed: 8 October 2026).</w:t>
       </w:r>
     </w:p>
     <w:p>
@@ -1579,7 +1579,7 @@
         <w:t>Strategic Management Journal</w:t>
       </w:r>
       <w:r>
-        <w:t>, 21(10-11), pp. 1105-1121.</w:t>
+        <w:t>, 21(10-11), pp. 1105-1121. Available at: https://doi.org/10.1002/1097-0266(200010/11)21:10/11&lt;1105::AID-SMJ133&gt;3.0.CO;2-E (Accessed: 8 October 2026).</w:t>
       </w:r>
     </w:p>
     <w:p>
@@ -1597,7 +1597,7 @@
         <w:t>European Management Journal</w:t>
       </w:r>
       <w:r>
-        <w:t>, 25(5), pp. 395-410.</w:t>
+        <w:t>, 25(5), pp. 395-410. Available at: https://doi.org/10.1016/j.emj.2007.08.005 (Accessed: 8 October 2026).</w:t>
       </w:r>
     </w:p>
     <w:p>
@@ -1615,7 +1615,7 @@
         <w:t>California Management Review</w:t>
       </w:r>
       <w:r>
-        <w:t>, 33(3), pp. 114-135.</w:t>
+        <w:t>, 33(3), pp. 114-135. Available at: https://doi.org/10.2307/41166664 (Accessed: 8 October 2026).</w:t>
       </w:r>
     </w:p>
     <w:p>
@@ -1651,7 +1651,7 @@
         <w:t>European Journal of Marketing</w:t>
       </w:r>
       <w:r>
-        <w:t>, 18(4), pp. 36-44.</w:t>
+        <w:t>, 18(4), pp. 36-44. Available at: https://doi.org/10.1108/EUM0000000004784 (Accessed: 8 October 2026).</w:t>
       </w:r>
     </w:p>
     <w:p>
@@ -1731,7 +1731,7 @@
         <w:t>Harvard Business Review</w:t>
       </w:r>
       <w:r>
-        <w:t>, 82(10), pp. 76-84.</w:t>
+        <w:t>, 82(10), pp. 76-84. Available at: https://hbr.org/2004/10/blue-ocean-strategy (Accessed: 8 October 2026).</w:t>
       </w:r>
     </w:p>
     <w:p>
@@ -1750,7 +1750,7 @@
         <w:t>Cornell Hotel and Restaurant Administration Quarterly</w:t>
       </w:r>
       <w:r>
-        <w:t>, 43(1), pp. 21-30.</w:t>
+        <w:t>, 43(1), pp. 21-30. Available at: https://pure.psu.edu/en/publications/perceived-fairness-of-yield-management/ (Accessed: 8 October 2026).</w:t>
       </w:r>
     </w:p>
     <w:p>
@@ -1768,7 +1768,7 @@
         <w:t>Tourism Management</w:t>
       </w:r>
       <w:r>
-        <w:t>, 29(3), pp. 458-468.</w:t>
+        <w:t>, 29(3), pp. 458-468. Available at: https://doi.org/10.1016/j.tourman.2007.05.011 (Accessed: 8 October 2026).</w:t>
       </w:r>
     </w:p>
     <w:p>
@@ -1786,7 +1786,7 @@
         <w:t>International Journal of Contemporary Hospitality Management</w:t>
       </w:r>
       <w:r>
-        <w:t>, 19(5), pp. 364-377.</w:t>
+        <w:t>, 19(5), pp. 364-377. Available at: https://doi.org/10.1108/09596110710757534 (Accessed: 8 October 2026).</w:t>
       </w:r>
     </w:p>
     <w:p>
@@ -1804,7 +1804,7 @@
         <w:t>Journal of Service Research</w:t>
       </w:r>
       <w:r>
-        <w:t>, 3(2), pp. 121-137.</w:t>
+        <w:t>, 3(2), pp. 121-137. Available at: https://doi.org/10.1177/109467050032002 (Accessed: 8 October 2026).</w:t>
       </w:r>
     </w:p>
     <w:p>
@@ -1840,7 +1840,7 @@
         <w:t>International Journal of Contemporary Hospitality Management</w:t>
       </w:r>
       <w:r>
-        <w:t>, 11(7), pp. 326-339.</w:t>
+        <w:t>, 11(7), pp. 326-339. Available at: https://doi.org/10.1108/09596119910293231 (Accessed: 8 October 2026).</w:t>
       </w:r>
     </w:p>
     <w:p>
@@ -1858,7 +1858,7 @@
         <w:t>Annals of Tourism Research</w:t>
       </w:r>
       <w:r>
-        <w:t>, 30(1), pp. 238-254.</w:t>
+        <w:t>, 30(1), pp. 238-254. Available at: https://doi.org/10.1016/S0160-7383(02)00064-6 (Accessed: 8 October 2026).</w:t>
       </w:r>
     </w:p>
     <w:p>
@@ -1894,7 +1894,7 @@
         <w:t>Journal of Marketing Research</w:t>
       </w:r>
       <w:r>
-        <w:t>, 36(3), pp. 356-372.</w:t>
+        <w:t>, 36(3), pp. 356-372. Available at: https://doi.org/10.1177/002224379903600305 (Accessed: 8 October 2026).</w:t>
       </w:r>
     </w:p>
     <w:p>
@@ -1912,7 +1912,7 @@
         <w:t>Tourism Management</w:t>
       </w:r>
       <w:r>
-        <w:t>, 32(6), pp. 1310-1323.</w:t>
+        <w:t>, 32(6), pp. 1310-1323. Available at: https://doi.org/10.1016/j.tourman.2010.12.011 (Accessed: 8 October 2026).</w:t>
       </w:r>
     </w:p>
     <w:p>
@@ -1930,7 +1930,7 @@
         <w:t>Harvard Business Review</w:t>
       </w:r>
       <w:r>
-        <w:t>, 71(1), pp. 84-93.</w:t>
+        <w:t>, 71(1), pp. 84-93. Available at: https://hbr.org/1993/01/customer-intimacy-and-other-value-disciplines (Accessed: 8 October 2026).</w:t>
       </w:r>
     </w:p>
     <w:p>
@@ -1948,7 +1948,7 @@
         <w:t>Journal of Business Research</w:t>
       </w:r>
       <w:r>
-        <w:t>, 49(2), pp. 193-211.</w:t>
+        <w:t>, 49(2), pp. 193-211. Available at: https://doi.org/10.1016/S0148-2963(99)00010-7 (Accessed: 8 October 2026).</w:t>
       </w:r>
     </w:p>
     <w:p>
@@ -1984,7 +1984,7 @@
         <w:t>Journal of Marketing</w:t>
       </w:r>
       <w:r>
-        <w:t>, 68(4), pp. 1-15.</w:t>
+        <w:t>, 68(4), pp. 1-15. Available at: https://doi.org/10.1509/jmkg.68.4.1.42733 (Accessed: 8 October 2026).</w:t>
       </w:r>
     </w:p>
     <w:p>
@@ -2020,7 +2020,7 @@
         <w:t>Journal of Marketing</w:t>
       </w:r>
       <w:r>
-        <w:t>, 52(3), pp. 2-22.</w:t>
+        <w:t>, 52(3), pp. 2-22. Available at: https://doi.org/10.1177/002224298805200302 (Accessed: 8 October 2026).</w:t>
       </w:r>
     </w:p>
     <w:p>
@@ -2039,7 +2039,7 @@
         <w:t>Journal of Service Research</w:t>
       </w:r>
       <w:r>
-        <w:t>, 13(1), pp. 67-82.</w:t>
+        <w:t>, 13(1), pp. 67-82. Available at: https://doi.org/10.1177/1094670509357611 (Accessed: 8 October 2026).</w:t>
       </w:r>
     </w:p>
     <w:p>

</xml_diff>